<commit_message>
docs: add student identification and remove unused academic fields
</commit_message>
<xml_diff>
--- a/artifacts/informe-api-postman.docx
+++ b/artifacts/informe-api-postman.docx
@@ -15,7 +15,7 @@
         <w:jc w:val="both"/>
       </w:pPr>
       <w:r>
-        <w:t>Estudiante: [Nombre del estudiante]    Carné: [Carné]</w:t>
+        <w:t>Estudiante: José Augusto Reyes Samayoa</w:t>
       </w:r>
     </w:p>
     <w:p>
@@ -23,7 +23,7 @@
         <w:jc w:val="both"/>
       </w:pPr>
       <w:r>
-        <w:t>Curso: [Curso]    Docente: [Docente]    Sección: [Sección]</w:t>
+        <w:t>Carné: 2790-22-14075</w:t>
       </w:r>
     </w:p>
     <w:p>
@@ -1649,7 +1649,7 @@
         <w:jc w:val="both"/>
       </w:pPr>
       <w:r>
-        <w:t>Los campos personales permanecen editables porque no fueron proporcionados. La API no tiene vulnerabilidades reportadas en sus dependencias de ejecución; Newman conserva avisos de dependencias de desarrollo documentados en el repositorio. Esta entrega corresponde a una práctica local con datos ficticios.</w:t>
+        <w:t>La API no tiene vulnerabilidades reportadas en sus dependencias de ejecución; Newman conserva avisos de dependencias de desarrollo documentados en el repositorio. Esta entrega corresponde a una práctica local con datos ficticios.</w:t>
       </w:r>
     </w:p>
     <w:sectPr>

</xml_diff>

<commit_message>
docs: remove final report section and exclude PDF from publication
</commit_message>
<xml_diff>
--- a/artifacts/informe-api-postman.docx
+++ b/artifacts/informe-api-postman.docx
@@ -1617,39 +1617,7 @@
         <w:jc w:val="both"/>
       </w:pPr>
       <w:r>
-        <w:t>El repositorio sigue siendo privado; el docente necesita permisos de lectura. Incluye código, contrato, matriz, colección, ambiente sin secretos, scripts, resultados, capturas, DOCX y PDF. Para verificar todo: npm ci y npm run verify. Para la aplicación gráfica: npm run seed, npm start e importar los archivos indicados en el README.</w:t>
-      </w:r>
-    </w:p>
-    <w:p>
-      <w:pPr>
-        <w:pStyle w:val="Heading1"/>
-      </w:pPr>
-      <w:r>
-        <w:t>12. Apoyo de IA y verificación</w:t>
-      </w:r>
-    </w:p>
-    <w:p>
-      <w:pPr>
-        <w:jc w:val="both"/>
-      </w:pPr>
-      <w:r>
-        <w:t>Codex apoyó la implementación, integración, pruebas, documentación y generación de evidencias. Se ejecutaron solicitudes reales, se revisaron resultados y se renderizaron las páginas del PDF. Las capturas corresponden a Postman y al informe de Newman; no se generaron imágenes artificiales para representar pruebas.</w:t>
-      </w:r>
-    </w:p>
-    <w:p>
-      <w:pPr>
-        <w:jc w:val="both"/>
-      </w:pPr>
-      <w:r>
-        <w:t>Claude Code no estaba instalado ni disponible en las rutas comprobadas. Por ello no participó ni realizó una revisión independiente. No se atribuyen conversaciones o resultados a esa herramienta. Tampoco se grabó un video.</w:t>
-      </w:r>
-    </w:p>
-    <w:p>
-      <w:pPr>
-        <w:jc w:val="both"/>
-      </w:pPr>
-      <w:r>
-        <w:t>La API no tiene vulnerabilidades reportadas en sus dependencias de ejecución; Newman conserva avisos de dependencias de desarrollo documentados en el repositorio. Esta entrega corresponde a una práctica local con datos ficticios.</w:t>
+        <w:t>El repositorio es público y el docente puede consultarlo sin solicitar permisos. Incluye código, contrato, matriz, colección, ambiente sin secretos, scripts, resultados, capturas y el DOCX editable. El PDF se entrega por separado y no se incluye en GitHub. Para verificar todo: npm ci y npm run verify. Para la aplicación gráfica: npm run seed, npm start e importar los archivos indicados en el README.</w:t>
       </w:r>
     </w:p>
     <w:sectPr>

</xml_diff>

<commit_message>
docs: use test terminology throughout the academic report
</commit_message>
<xml_diff>
--- a/artifacts/informe-api-postman.docx
+++ b/artifacts/informe-api-postman.docx
@@ -47,7 +47,7 @@
         <w:jc w:val="both"/>
       </w:pPr>
       <w:r>
-        <w:t>La práctica integra una API de pedidos y una colección que comprueba su comportamiento con datos ficticios. No basta con que el servidor responda: también se revisan los permisos, la persistencia, las reglas de entrada y el contrato de las respuestas. Las evidencias incluidas proceden de ejecuciones reales en Windows.</w:t>
+        <w:t>La práctica integra una API de pedidos y una colección que comprueba su comportamiento con datos de prueba. No basta con que el servidor responda: también se revisan los permisos, la persistencia, las reglas de entrada y el contrato de las respuestas. Las evidencias incluidas proceden de ejecuciones reales en Windows.</w:t>
       </w:r>
     </w:p>
     <w:p>
@@ -79,7 +79,7 @@
         <w:jc w:val="both"/>
       </w:pPr>
       <w:r>
-        <w:t>Se utilizó Node.js 24.18.0, Express 5.3.0 y SQLite 3.53.1. Dos usuarios ficticios obtienen sesiones temporales y administran únicamente sus pedidos. Los importes se calculan en centavos enteros; el propietario se obtiene de la sesión. Los errores tienen código, mensaje, detalles y un identificador de correlación.</w:t>
+        <w:t>Se utilizó Node.js 24.18.0, Express 5.3.0 y SQLite 3.53.1. Dos usuarios de pruebas obtienen sesiones temporales y administran únicamente sus pedidos. Los importes se calculan en centavos enteros; el propietario se obtiene de la sesión. Los errores tienen código, mensaje, detalles y un identificador de correlación.</w:t>
       </w:r>
     </w:p>
     <w:tbl>
@@ -167,7 +167,7 @@
                 <w:rFonts w:ascii="Arial" w:hAnsi="Arial"/>
                 <w:sz w:val="22"/>
               </w:rPr>
-              <w:t>Autenticar al usuario ficticio.</w:t>
+              <w:t>Autenticar al usuario de pruebas.</w:t>
             </w:r>
           </w:p>
         </w:tc>
@@ -334,7 +334,7 @@
         <w:jc w:val="both"/>
       </w:pPr>
       <w:r>
-        <w:t>La API escucha por defecto en http://127.0.0.1:3000. El comando npm run seed genera credenciales ficticias locales y restablece los datos. SQLite y el ambiente con contraseñas quedan excluidos de Git.</w:t>
+        <w:t>La API escucha por defecto en http://127.0.0.1:3000. El comando npm run seed genera credenciales locales de prueba y restablece los datos. SQLite y el ambiente con contraseñas quedan excluidos de Git.</w:t>
       </w:r>
     </w:p>
     <w:p>
@@ -419,7 +419,7 @@
         <w:jc w:val="both"/>
       </w:pPr>
       <w:r>
-        <w:t>Para la ejecución se seleccionó el ambiente local con usuarios ficticios; sus contraseñas se muestran ocultas y no forman parte del repositorio.</w:t>
+        <w:t>Para la ejecución se seleccionó el ambiente local con usuarios de pruebas; sus contraseñas se muestran ocultas y no forman parte del repositorio.</w:t>
       </w:r>
     </w:p>
     <w:p>
@@ -430,7 +430,7 @@
       <w:r>
         <w:drawing>
           <wp:inline xmlns:a="http://schemas.openxmlformats.org/drawingml/2006/main" xmlns:pic="http://schemas.openxmlformats.org/drawingml/2006/picture">
-            <wp:extent cx="5943600" cy="2075994"/>
+            <wp:extent cx="5943600" cy="1734734"/>
             <wp:docPr id="2" name="Picture 2"/>
             <wp:cNvGraphicFramePr>
               <a:graphicFrameLocks noChangeAspect="1"/>
@@ -439,7 +439,7 @@
               <a:graphicData uri="http://schemas.openxmlformats.org/drawingml/2006/picture">
                 <pic:pic>
                   <pic:nvPicPr>
-                    <pic:cNvPr id="0" name="postman-environment-local.png"/>
+                    <pic:cNvPr id="0" name="postman-environment-variables.png"/>
                     <pic:cNvPicPr/>
                   </pic:nvPicPr>
                   <pic:blipFill>
@@ -451,7 +451,7 @@
                   <pic:spPr>
                     <a:xfrm>
                       <a:off x="0" y="0"/>
-                      <a:ext cx="5943600" cy="2075994"/>
+                      <a:ext cx="5943600" cy="1734734"/>
                     </a:xfrm>
                     <a:prstGeom prst="rect"/>
                   </pic:spPr>

</xml_diff>